<commit_message>
fix(docpack): RTL Word output (section + style bidi)
The exported Word document was rendering left-aligned in some places
because the source template only marked <w:bidi/> per paragraph, not at
the section or style level. When docxtemplater filled {#loops} or
inserted images, any wrapper paragraphs inherited from the 'Normal'
style which had no bidi, so they fell back to LTR.

Fix:
- Section-level <w:bidi/> via sectPr (cascades to all dynamic content).
- Style-level <w:bidi/> + jc=right on Normal, Heading 1, Heading 2,
  Heading 3, and List Bullet styles.

After regenerating templates/cctv.docx, styles.xml now carries 5 bidi
tags (was 0) and sectPr carries 1 bidi tag (was 0). Any future loop or
image insertion inherits RTL automatically.

Co-Authored-By: Claude Sonnet 4.6 <noreply@anthropic.com>
</commit_message>
<xml_diff>
--- a/templates/cctv.docx
+++ b/templates/cctv.docx
@@ -1864,6 +1864,7 @@
       </w:r>
     </w:p>
     <w:sectPr>
+      <w:bidi w:val="1"/>
       <w:pgSz w:w="12240" w:h="15840"/>
       <w:pgMar w:top="1440" w:right="1800" w:bottom="1440" w:left="1800" w:header="720" w:footer="720" w:gutter="0"/>
       <w:cols w:space="720"/>
@@ -2236,6 +2237,10 @@
     <w:name w:val="Normal"/>
     <w:qFormat/>
     <w:rsid w:val="00FC693F"/>
+    <w:pPr>
+      <w:bidi w:val="1"/>
+      <w:jc w:val="right"/>
+    </w:pPr>
     <w:rPr>
       <w:rFonts w:ascii="Arial" w:hAnsi="Arial"/>
       <w:sz w:val="22"/>
@@ -2298,6 +2303,8 @@
       <w:keepLines/>
       <w:spacing w:before="480" w:after="0"/>
       <w:outlineLvl w:val="0"/>
+      <w:bidi w:val="1"/>
+      <w:jc w:val="right"/>
     </w:pPr>
     <w:rPr>
       <w:rFonts w:asciiTheme="majorHAnsi" w:eastAsiaTheme="majorEastAsia" w:hAnsiTheme="majorHAnsi" w:cstheme="majorBidi"/>
@@ -2322,6 +2329,8 @@
       <w:keepLines/>
       <w:spacing w:before="200" w:after="0"/>
       <w:outlineLvl w:val="1"/>
+      <w:bidi w:val="1"/>
+      <w:jc w:val="right"/>
     </w:pPr>
     <w:rPr>
       <w:rFonts w:asciiTheme="majorHAnsi" w:eastAsiaTheme="majorEastAsia" w:hAnsiTheme="majorHAnsi" w:cstheme="majorBidi"/>
@@ -2346,6 +2355,8 @@
       <w:keepLines/>
       <w:spacing w:before="200" w:after="0"/>
       <w:outlineLvl w:val="2"/>
+      <w:bidi w:val="1"/>
+      <w:jc w:val="right"/>
     </w:pPr>
     <w:rPr>
       <w:rFonts w:asciiTheme="majorHAnsi" w:eastAsiaTheme="majorEastAsia" w:hAnsiTheme="majorHAnsi" w:cstheme="majorBidi"/>
@@ -2768,6 +2779,8 @@
         <w:numId w:val="1"/>
       </w:numPr>
       <w:contextualSpacing/>
+      <w:bidi w:val="1"/>
+      <w:jc w:val="right"/>
     </w:pPr>
   </w:style>
   <w:style w:type="paragraph" w:styleId="ListBullet2">

</xml_diff>

<commit_message>
Remove filename/company text labels from datasheet appendix
The {name} and {mfr} text paragraphs before each datasheet's pages
have been removed. Now only the rendered PDF page images appear in
the appendix — no text metadata labels.

Co-Authored-By: Claude Sonnet 4.6 <noreply@anthropic.com>
</commit_message>
<xml_diff>
--- a/templates/cctv.docx
+++ b/templates/cctv.docx
@@ -1904,36 +1904,6 @@
       <w:r>
         <w:rPr>
           <w:rFonts w:ascii="Arial" w:hAnsi="Arial"/>
-          <w:b/>
-          <w:color w:val="1A2A4A"/>
-          <w:sz w:val="26"/>
-        </w:rPr>
-        <w:t>{name}</w:t>
-      </w:r>
-    </w:p>
-    <w:p>
-      <w:pPr>
-        <w:bidi w:val="1"/>
-        <w:jc w:val="right"/>
-      </w:pPr>
-      <w:r>
-        <w:rPr>
-          <w:rFonts w:ascii="Arial" w:hAnsi="Arial"/>
-          <w:i/>
-          <w:color w:val="607080"/>
-          <w:sz w:val="20"/>
-        </w:rPr>
-        <w:t>{mfr}</w:t>
-      </w:r>
-    </w:p>
-    <w:p>
-      <w:pPr>
-        <w:bidi w:val="1"/>
-        <w:jc w:val="right"/>
-      </w:pPr>
-      <w:r>
-        <w:rPr>
-          <w:rFonts w:ascii="Arial" w:hAnsi="Arial"/>
         </w:rPr>
         <w:t>{#pages}</w:t>
       </w:r>

</xml_diff>

<commit_message>
Add run-level <w:rtl/> for Google Docs RTL compatibility
Google Docs largely ignores Word's paragraph-level <w:bidi/> when
importing .docx files. Run-level <w:rtl/> in w:rPr is respected by
both Word and Google Docs.

Changes:
- New set_run_rtl(run): stamps <w:rtl/> on a run's rPr
- New set_style_run_rtl(style): stamps <w:rtl/> on a style's rPr
  so all runs inheriting that style (including docxtemplater-generated
  ones) are RTL
- set_document_hebrew(): also stamps <w:rtl/> on rPrDefault
- add_para_rtl/add_heading_rtl/add_bullet_rtl: call set_run_rtl()
  on every created run
- build(): calls set_style_run_rtl() on Normal, Heading 1-3,
  List Bullet, Default Paragraph Font

Co-Authored-By: Claude Sonnet 4.6 <noreply@anthropic.com>
</commit_message>
<xml_diff>
--- a/templates/cctv.docx
+++ b/templates/cctv.docx
@@ -27,6 +27,7 @@
           <w:b/>
           <w:color w:val="1A2A4A"/>
           <w:sz w:val="72"/>
+          <w:rtl/>
         </w:rPr>
         <w:t>תיק תיעוד</w:t>
       </w:r>
@@ -41,6 +42,7 @@
           <w:rFonts w:ascii="Arial" w:hAnsi="Arial"/>
           <w:color w:val="607080"/>
           <w:sz w:val="40"/>
+          <w:rtl/>
         </w:rPr>
         <w:t>AS-MADE</w:t>
       </w:r>
@@ -55,6 +57,7 @@
           <w:rFonts w:ascii="Arial" w:hAnsi="Arial"/>
           <w:b/>
           <w:sz w:val="56"/>
+          <w:rtl/>
         </w:rPr>
         <w:t>{site_name}</w:t>
       </w:r>
@@ -68,6 +71,7 @@
         <w:rPr>
           <w:rFonts w:ascii="Arial" w:hAnsi="Arial"/>
           <w:sz w:val="32"/>
+          <w:rtl/>
         </w:rPr>
         <w:t>{site_address}</w:t>
       </w:r>
@@ -82,6 +86,7 @@
           <w:rFonts w:ascii="Arial" w:hAnsi="Arial"/>
           <w:i/>
           <w:sz w:val="24"/>
+          <w:rtl/>
         </w:rPr>
         <w:t>{site_subtitle}</w:t>
       </w:r>
@@ -94,6 +99,7 @@
       <w:r>
         <w:rPr>
           <w:rFonts w:ascii="Arial" w:hAnsi="Arial"/>
+          <w:rtl/>
         </w:rPr>
         <w:br/>
       </w:r>
@@ -710,6 +716,9 @@
         <w:jc w:val="right"/>
       </w:pPr>
       <w:r>
+        <w:rPr>
+          <w:rtl/>
+        </w:rPr>
         <w:t>הקדמה</w:t>
       </w:r>
     </w:p>
@@ -721,6 +730,7 @@
       <w:r>
         <w:rPr>
           <w:rFonts w:ascii="Arial" w:hAnsi="Arial"/>
+          <w:rtl/>
         </w:rPr>
         <w:t>{intro_text}</w:t>
       </w:r>
@@ -738,6 +748,9 @@
         <w:jc w:val="right"/>
       </w:pPr>
       <w:r>
+        <w:rPr>
+          <w:rtl/>
+        </w:rPr>
         <w:t>תכולת הפרויקט</w:t>
       </w:r>
     </w:p>
@@ -750,6 +763,7 @@
       <w:r>
         <w:rPr>
           <w:rFonts w:ascii="Arial" w:hAnsi="Arial"/>
+          <w:rtl/>
         </w:rPr>
         <w:t>{#scope_items}{text}{/scope_items}</w:t>
       </w:r>
@@ -767,6 +781,9 @@
         <w:jc w:val="right"/>
       </w:pPr>
       <w:r>
+        <w:rPr>
+          <w:rtl/>
+        </w:rPr>
         <w:t>ארכיטקטורת רשת התקשורת</w:t>
       </w:r>
     </w:p>
@@ -778,6 +795,7 @@
       <w:r>
         <w:rPr>
           <w:rFonts w:ascii="Arial" w:hAnsi="Arial"/>
+          <w:rtl/>
         </w:rPr>
         <w:t>{network_arch_text}</w:t>
       </w:r>
@@ -797,6 +815,7 @@
         <w:rPr>
           <w:rFonts w:ascii="Arial" w:hAnsi="Arial"/>
           <w:b/>
+          <w:rtl/>
         </w:rPr>
         <w:t>דיאגרמת רשת:</w:t>
       </w:r>
@@ -809,6 +828,7 @@
       <w:r>
         <w:rPr>
           <w:rFonts w:ascii="Arial" w:hAnsi="Arial"/>
+          <w:rtl/>
         </w:rPr>
         <w:t>{%network_diagram_img}</w:t>
       </w:r>
@@ -826,6 +846,9 @@
         <w:jc w:val="right"/>
       </w:pPr>
       <w:r>
+        <w:rPr>
+          <w:rtl/>
+        </w:rPr>
         <w:t>שרטוט AS-MADE</w:t>
       </w:r>
     </w:p>
@@ -838,6 +861,7 @@
         <w:rPr>
           <w:rFonts w:ascii="Arial" w:hAnsi="Arial"/>
           <w:b/>
+          <w:rtl/>
         </w:rPr>
         <w:t>תכנית האתר:</w:t>
       </w:r>
@@ -850,6 +874,7 @@
       <w:r>
         <w:rPr>
           <w:rFonts w:ascii="Arial" w:hAnsi="Arial"/>
+          <w:rtl/>
         </w:rPr>
         <w:t>{%site_plan_img}</w:t>
       </w:r>
@@ -869,6 +894,7 @@
         <w:rPr>
           <w:rFonts w:ascii="Arial" w:hAnsi="Arial"/>
           <w:b/>
+          <w:rtl/>
         </w:rPr>
         <w:t>תמונות מהשטח:</w:t>
       </w:r>
@@ -881,6 +907,7 @@
       <w:r>
         <w:rPr>
           <w:rFonts w:ascii="Arial" w:hAnsi="Arial"/>
+          <w:rtl/>
         </w:rPr>
         <w:t>{#photos}</w:t>
       </w:r>
@@ -893,6 +920,7 @@
       <w:r>
         <w:rPr>
           <w:rFonts w:ascii="Arial" w:hAnsi="Arial"/>
+          <w:rtl/>
         </w:rPr>
         <w:t>{%img}</w:t>
       </w:r>
@@ -907,6 +935,7 @@
           <w:rFonts w:ascii="Arial" w:hAnsi="Arial"/>
           <w:i/>
           <w:sz w:val="20"/>
+          <w:rtl/>
         </w:rPr>
         <w:t>{caption}</w:t>
       </w:r>
@@ -919,6 +948,7 @@
       <w:r>
         <w:rPr>
           <w:rFonts w:ascii="Arial" w:hAnsi="Arial"/>
+          <w:rtl/>
         </w:rPr>
         <w:t>{/photos}</w:t>
       </w:r>
@@ -935,6 +965,9 @@
         <w:jc w:val="right"/>
       </w:pPr>
       <w:r>
+        <w:rPr>
+          <w:rtl/>
+        </w:rPr>
         <w:t>רשימת ציוד וכתובות IP</w:t>
       </w:r>
     </w:p>
@@ -945,6 +978,9 @@
         <w:jc w:val="right"/>
       </w:pPr>
       <w:r>
+        <w:rPr>
+          <w:rtl/>
+        </w:rPr>
         <w:t>רשימת מצלמות</w:t>
       </w:r>
     </w:p>
@@ -1297,6 +1333,9 @@
         <w:jc w:val="right"/>
       </w:pPr>
       <w:r>
+        <w:rPr>
+          <w:rtl/>
+        </w:rPr>
         <w:t>רשימת עורקים</w:t>
       </w:r>
     </w:p>
@@ -1603,6 +1642,9 @@
         <w:jc w:val="right"/>
       </w:pPr>
       <w:r>
+        <w:rPr>
+          <w:rtl/>
+        </w:rPr>
         <w:t>רשימת מתגים</w:t>
       </w:r>
     </w:p>
@@ -1862,6 +1904,9 @@
         <w:jc w:val="right"/>
       </w:pPr>
       <w:r>
+        <w:rPr>
+          <w:rtl/>
+        </w:rPr>
         <w:t>נספח — דפי מוצר</w:t>
       </w:r>
     </w:p>
@@ -1874,6 +1919,7 @@
         <w:rPr>
           <w:rFonts w:ascii="Arial" w:hAnsi="Arial"/>
           <w:sz w:val="21"/>
+          <w:rtl/>
         </w:rPr>
         <w:t>דפי המוצר של כל הרכיבים בפרויקט. כל דאטה-שיט מופיע בעמוד נפרד.</w:t>
       </w:r>
@@ -1892,6 +1938,7 @@
       <w:r>
         <w:rPr>
           <w:rFonts w:ascii="Arial" w:hAnsi="Arial"/>
+          <w:rtl/>
         </w:rPr>
         <w:t>{#datasheets}</w:t>
       </w:r>
@@ -1904,6 +1951,7 @@
       <w:r>
         <w:rPr>
           <w:rFonts w:ascii="Arial" w:hAnsi="Arial"/>
+          <w:rtl/>
         </w:rPr>
         <w:t>{#pages}</w:t>
       </w:r>
@@ -1916,6 +1964,7 @@
       <w:r>
         <w:rPr>
           <w:rFonts w:ascii="Arial" w:hAnsi="Arial"/>
+          <w:rtl/>
         </w:rPr>
         <w:t>{%page_img}</w:t>
       </w:r>
@@ -1928,6 +1977,7 @@
       <w:r>
         <w:rPr>
           <w:rFonts w:ascii="Arial" w:hAnsi="Arial"/>
+          <w:rtl/>
         </w:rPr>
         <w:t>{/pages}</w:t>
       </w:r>
@@ -1946,6 +1996,7 @@
       <w:r>
         <w:rPr>
           <w:rFonts w:ascii="Arial" w:hAnsi="Arial"/>
+          <w:rtl/>
         </w:rPr>
         <w:t>{/datasheets}</w:t>
       </w:r>
@@ -1973,6 +2024,7 @@
           <w:i/>
           <w:color w:val="607080"/>
           <w:sz w:val="18"/>
+          <w:rtl/>
         </w:rPr>
         <w:t>תיק תיעוד זה הופק אוטומטית ממערכת אפקון.</w:t>
       </w:r>
@@ -2200,6 +2252,7 @@
         <w:sz w:val="22"/>
         <w:szCs w:val="22"/>
         <w:lang w:val="he-IL" w:eastAsia="he-IL" w:bidi="he-IL"/>
+        <w:rtl/>
       </w:rPr>
     </w:rPrDefault>
     <w:pPrDefault>
@@ -2358,6 +2411,7 @@
     <w:rPr>
       <w:rFonts w:ascii="Arial" w:hAnsi="Arial"/>
       <w:sz w:val="22"/>
+      <w:rtl/>
     </w:rPr>
   </w:style>
   <w:style w:type="paragraph" w:styleId="Header">
@@ -2427,6 +2481,7 @@
       <w:color w:val="365F91" w:themeColor="accent1" w:themeShade="BF"/>
       <w:sz w:val="28"/>
       <w:szCs w:val="28"/>
+      <w:rtl/>
     </w:rPr>
   </w:style>
   <w:style w:type="paragraph" w:styleId="Heading2">
@@ -2453,6 +2508,7 @@
       <w:color w:val="4F81BD" w:themeColor="accent1"/>
       <w:sz w:val="26"/>
       <w:szCs w:val="26"/>
+      <w:rtl/>
     </w:rPr>
   </w:style>
   <w:style w:type="paragraph" w:styleId="Heading3">
@@ -2477,6 +2533,7 @@
       <w:b/>
       <w:bCs/>
       <w:color w:val="4F81BD" w:themeColor="accent1"/>
+      <w:rtl/>
     </w:rPr>
   </w:style>
   <w:style w:type="paragraph" w:styleId="Heading4">
@@ -2624,6 +2681,13 @@
     <w:uiPriority w:val="1"/>
     <w:semiHidden/>
     <w:unhideWhenUsed/>
+    <w:pPr>
+      <w:bidi w:val="1"/>
+      <w:jc w:val="right"/>
+    </w:pPr>
+    <w:rPr>
+      <w:rtl/>
+    </w:rPr>
   </w:style>
   <w:style w:type="table" w:default="1" w:styleId="TableNormal">
     <w:name w:val="Normal Table"/>
@@ -2896,6 +2960,9 @@
       <w:bidi w:val="1"/>
       <w:jc w:val="right"/>
     </w:pPr>
+    <w:rPr>
+      <w:rtl/>
+    </w:rPr>
   </w:style>
   <w:style w:type="paragraph" w:styleId="ListBullet2">
     <w:name w:val="List Bullet 2"/>

</xml_diff>

<commit_message>
fix(template): reverse table column physical order for Google Docs RTL
Google Docs ignores <w:bidiVisual/> so all tables were rendering in
physical left-to-right order, making Hebrew column headers appear on
the wrong side.

Remove set_table_rtl() (bidiVisual) from all four tables and physically
reverse column order instead.  Hebrew readers still see the correct
right-to-left sequence (מס"ד on the right, leftmost detail on the left)
in both Microsoft Word and Google Docs without any bidi table flags.

Tables changed:
- Cover-page info table: (person|org|function|role) — role label now rightmost
- Cameras: (מיקום|IP|פורט|סוג|שם|ארון|מס"ד) — מס"ד now rightmost
- Backhauls: (IP|מיקום|יצרן|מק"ט|סוג עורק|מס"ד)
- Switches: (IP|יצרן|מק"ט|מתגים|מס"ד)

Also adds set_run_rtl() calls on all table cell runs (header + data)
for consistent run-level RTL in Google Docs.

Co-Authored-By: Claude Sonnet 4.6 <noreply@anthropic.com>
</commit_message>
<xml_diff>
--- a/templates/cctv.docx
+++ b/templates/cctv.docx
@@ -109,7 +109,6 @@
         <w:tblStyle w:val="LightGrid-Accent1"/>
         <w:tblW w:type="auto" w:w="0"/>
         <w:tblLook w:firstColumn="1" w:firstRow="1" w:lastColumn="0" w:lastRow="0" w:noHBand="0" w:noVBand="1" w:val="04A0"/>
-        <w:bidiVisual w:val="1"/>
       </w:tblPr>
       <w:tblGrid>
         <w:gridCol w:w="2160"/>
@@ -122,7 +121,6 @@
           <w:tcPr>
             <w:tcW w:type="dxa" w:w="2160"/>
             <w:vAlign w:val="center"/>
-            <w:shd w:val="clear" w:color="auto" w:fill="E8EEF7"/>
           </w:tcPr>
           <w:p>
             <w:pPr>
@@ -134,8 +132,30 @@
               <w:rPr>
                 <w:rFonts w:ascii="Arial" w:hAnsi="Arial"/>
                 <w:sz w:val="22"/>
+                <w:rtl/>
               </w:rPr>
-              <w:t>מגיש</w:t>
+              <w:t>{contractor_person}</w:t>
+            </w:r>
+          </w:p>
+        </w:tc>
+        <w:tc>
+          <w:tcPr>
+            <w:tcW w:type="dxa" w:w="2160"/>
+            <w:vAlign w:val="center"/>
+          </w:tcPr>
+          <w:p>
+            <w:pPr>
+              <w:bidi w:val="1"/>
+              <w:jc w:val="right"/>
+            </w:pPr>
+            <w:r/>
+            <w:r>
+              <w:rPr>
+                <w:rFonts w:ascii="Arial" w:hAnsi="Arial"/>
+                <w:sz w:val="22"/>
+                <w:rtl/>
+              </w:rPr>
+              <w:t>{contractor_org}</w:t>
             </w:r>
           </w:p>
         </w:tc>
@@ -155,8 +175,54 @@
               <w:rPr>
                 <w:rFonts w:ascii="Arial" w:hAnsi="Arial"/>
                 <w:sz w:val="22"/>
+                <w:rtl/>
               </w:rPr>
               <w:t>גורם מבצע</w:t>
+            </w:r>
+          </w:p>
+        </w:tc>
+        <w:tc>
+          <w:tcPr>
+            <w:tcW w:type="dxa" w:w="2160"/>
+            <w:vAlign w:val="center"/>
+            <w:shd w:val="clear" w:color="auto" w:fill="E8EEF7"/>
+          </w:tcPr>
+          <w:p>
+            <w:pPr>
+              <w:bidi w:val="1"/>
+              <w:jc w:val="right"/>
+            </w:pPr>
+            <w:r/>
+            <w:r>
+              <w:rPr>
+                <w:rFonts w:ascii="Arial" w:hAnsi="Arial"/>
+                <w:sz w:val="22"/>
+                <w:rtl/>
+              </w:rPr>
+              <w:t>מגיש</w:t>
+            </w:r>
+          </w:p>
+        </w:tc>
+      </w:tr>
+      <w:tr>
+        <w:tc>
+          <w:tcPr>
+            <w:tcW w:type="dxa" w:w="2160"/>
+            <w:vAlign w:val="center"/>
+          </w:tcPr>
+          <w:p>
+            <w:pPr>
+              <w:bidi w:val="1"/>
+              <w:jc w:val="right"/>
+            </w:pPr>
+            <w:r/>
+            <w:r>
+              <w:rPr>
+                <w:rFonts w:ascii="Arial" w:hAnsi="Arial"/>
+                <w:sz w:val="22"/>
+                <w:rtl/>
+              </w:rPr>
+              <w:t>{pm_person}</w:t>
             </w:r>
           </w:p>
         </w:tc>
@@ -175,51 +241,9 @@
               <w:rPr>
                 <w:rFonts w:ascii="Arial" w:hAnsi="Arial"/>
                 <w:sz w:val="22"/>
+                <w:rtl/>
               </w:rPr>
-              <w:t>{contractor_org}</w:t>
-            </w:r>
-          </w:p>
-        </w:tc>
-        <w:tc>
-          <w:tcPr>
-            <w:tcW w:type="dxa" w:w="2160"/>
-            <w:vAlign w:val="center"/>
-          </w:tcPr>
-          <w:p>
-            <w:pPr>
-              <w:bidi w:val="1"/>
-              <w:jc w:val="right"/>
-            </w:pPr>
-            <w:r/>
-            <w:r>
-              <w:rPr>
-                <w:rFonts w:ascii="Arial" w:hAnsi="Arial"/>
-                <w:sz w:val="22"/>
-              </w:rPr>
-              <w:t>{contractor_person}</w:t>
-            </w:r>
-          </w:p>
-        </w:tc>
-      </w:tr>
-      <w:tr>
-        <w:tc>
-          <w:tcPr>
-            <w:tcW w:type="dxa" w:w="2160"/>
-            <w:vAlign w:val="center"/>
-            <w:shd w:val="clear" w:color="auto" w:fill="E8EEF7"/>
-          </w:tcPr>
-          <w:p>
-            <w:pPr>
-              <w:bidi w:val="1"/>
-              <w:jc w:val="right"/>
-            </w:pPr>
-            <w:r/>
-            <w:r>
-              <w:rPr>
-                <w:rFonts w:ascii="Arial" w:hAnsi="Arial"/>
-                <w:sz w:val="22"/>
-              </w:rPr>
-              <w:t>מגיש</w:t>
+              <w:t>{pm_org}</w:t>
             </w:r>
           </w:p>
         </w:tc>
@@ -239,8 +263,54 @@
               <w:rPr>
                 <w:rFonts w:ascii="Arial" w:hAnsi="Arial"/>
                 <w:sz w:val="22"/>
+                <w:rtl/>
               </w:rPr>
               <w:t>גורם מוביל</w:t>
+            </w:r>
+          </w:p>
+        </w:tc>
+        <w:tc>
+          <w:tcPr>
+            <w:tcW w:type="dxa" w:w="2160"/>
+            <w:vAlign w:val="center"/>
+            <w:shd w:val="clear" w:color="auto" w:fill="E8EEF7"/>
+          </w:tcPr>
+          <w:p>
+            <w:pPr>
+              <w:bidi w:val="1"/>
+              <w:jc w:val="right"/>
+            </w:pPr>
+            <w:r/>
+            <w:r>
+              <w:rPr>
+                <w:rFonts w:ascii="Arial" w:hAnsi="Arial"/>
+                <w:sz w:val="22"/>
+                <w:rtl/>
+              </w:rPr>
+              <w:t>מגיש</w:t>
+            </w:r>
+          </w:p>
+        </w:tc>
+      </w:tr>
+      <w:tr>
+        <w:tc>
+          <w:tcPr>
+            <w:tcW w:type="dxa" w:w="2160"/>
+            <w:vAlign w:val="center"/>
+          </w:tcPr>
+          <w:p>
+            <w:pPr>
+              <w:bidi w:val="1"/>
+              <w:jc w:val="right"/>
+            </w:pPr>
+            <w:r/>
+            <w:r>
+              <w:rPr>
+                <w:rFonts w:ascii="Arial" w:hAnsi="Arial"/>
+                <w:sz w:val="22"/>
+                <w:rtl/>
+              </w:rPr>
+              <w:t>{customer_person}</w:t>
             </w:r>
           </w:p>
         </w:tc>
@@ -259,51 +329,9 @@
               <w:rPr>
                 <w:rFonts w:ascii="Arial" w:hAnsi="Arial"/>
                 <w:sz w:val="22"/>
+                <w:rtl/>
               </w:rPr>
-              <w:t>{pm_org}</w:t>
-            </w:r>
-          </w:p>
-        </w:tc>
-        <w:tc>
-          <w:tcPr>
-            <w:tcW w:type="dxa" w:w="2160"/>
-            <w:vAlign w:val="center"/>
-          </w:tcPr>
-          <w:p>
-            <w:pPr>
-              <w:bidi w:val="1"/>
-              <w:jc w:val="right"/>
-            </w:pPr>
-            <w:r/>
-            <w:r>
-              <w:rPr>
-                <w:rFonts w:ascii="Arial" w:hAnsi="Arial"/>
-                <w:sz w:val="22"/>
-              </w:rPr>
-              <w:t>{pm_person}</w:t>
-            </w:r>
-          </w:p>
-        </w:tc>
-      </w:tr>
-      <w:tr>
-        <w:tc>
-          <w:tcPr>
-            <w:tcW w:type="dxa" w:w="2160"/>
-            <w:vAlign w:val="center"/>
-            <w:shd w:val="clear" w:color="auto" w:fill="E8EEF7"/>
-          </w:tcPr>
-          <w:p>
-            <w:pPr>
-              <w:bidi w:val="1"/>
-              <w:jc w:val="right"/>
-            </w:pPr>
-            <w:r/>
-            <w:r>
-              <w:rPr>
-                <w:rFonts w:ascii="Arial" w:hAnsi="Arial"/>
-                <w:sz w:val="22"/>
-              </w:rPr>
-              <w:t>מקבל</w:t>
+              <w:t>{customer_org}</w:t>
             </w:r>
           </w:p>
         </w:tc>
@@ -323,8 +351,54 @@
               <w:rPr>
                 <w:rFonts w:ascii="Arial" w:hAnsi="Arial"/>
                 <w:sz w:val="22"/>
+                <w:rtl/>
               </w:rPr>
               <w:t>לקוח סופי</w:t>
+            </w:r>
+          </w:p>
+        </w:tc>
+        <w:tc>
+          <w:tcPr>
+            <w:tcW w:type="dxa" w:w="2160"/>
+            <w:vAlign w:val="center"/>
+            <w:shd w:val="clear" w:color="auto" w:fill="E8EEF7"/>
+          </w:tcPr>
+          <w:p>
+            <w:pPr>
+              <w:bidi w:val="1"/>
+              <w:jc w:val="right"/>
+            </w:pPr>
+            <w:r/>
+            <w:r>
+              <w:rPr>
+                <w:rFonts w:ascii="Arial" w:hAnsi="Arial"/>
+                <w:sz w:val="22"/>
+                <w:rtl/>
+              </w:rPr>
+              <w:t>מקבל</w:t>
+            </w:r>
+          </w:p>
+        </w:tc>
+      </w:tr>
+      <w:tr>
+        <w:tc>
+          <w:tcPr>
+            <w:tcW w:type="dxa" w:w="2160"/>
+            <w:vAlign w:val="center"/>
+          </w:tcPr>
+          <w:p>
+            <w:pPr>
+              <w:bidi w:val="1"/>
+              <w:jc w:val="right"/>
+            </w:pPr>
+            <w:r/>
+            <w:r>
+              <w:rPr>
+                <w:rFonts w:ascii="Arial" w:hAnsi="Arial"/>
+                <w:sz w:val="22"/>
+                <w:rtl/>
+              </w:rPr>
+              <w:t>{consultant_person}</w:t>
             </w:r>
           </w:p>
         </w:tc>
@@ -343,51 +417,9 @@
               <w:rPr>
                 <w:rFonts w:ascii="Arial" w:hAnsi="Arial"/>
                 <w:sz w:val="22"/>
+                <w:rtl/>
               </w:rPr>
-              <w:t>{customer_org}</w:t>
-            </w:r>
-          </w:p>
-        </w:tc>
-        <w:tc>
-          <w:tcPr>
-            <w:tcW w:type="dxa" w:w="2160"/>
-            <w:vAlign w:val="center"/>
-          </w:tcPr>
-          <w:p>
-            <w:pPr>
-              <w:bidi w:val="1"/>
-              <w:jc w:val="right"/>
-            </w:pPr>
-            <w:r/>
-            <w:r>
-              <w:rPr>
-                <w:rFonts w:ascii="Arial" w:hAnsi="Arial"/>
-                <w:sz w:val="22"/>
-              </w:rPr>
-              <w:t>{customer_person}</w:t>
-            </w:r>
-          </w:p>
-        </w:tc>
-      </w:tr>
-      <w:tr>
-        <w:tc>
-          <w:tcPr>
-            <w:tcW w:type="dxa" w:w="2160"/>
-            <w:vAlign w:val="center"/>
-            <w:shd w:val="clear" w:color="auto" w:fill="E8EEF7"/>
-          </w:tcPr>
-          <w:p>
-            <w:pPr>
-              <w:bidi w:val="1"/>
-              <w:jc w:val="right"/>
-            </w:pPr>
-            <w:r/>
-            <w:r>
-              <w:rPr>
-                <w:rFonts w:ascii="Arial" w:hAnsi="Arial"/>
-                <w:sz w:val="22"/>
-              </w:rPr>
-              <w:t>בודק</w:t>
+              <w:t>{consultant_org}</w:t>
             </w:r>
           </w:p>
         </w:tc>
@@ -407,8 +439,54 @@
               <w:rPr>
                 <w:rFonts w:ascii="Arial" w:hAnsi="Arial"/>
                 <w:sz w:val="22"/>
+                <w:rtl/>
               </w:rPr>
               <w:t>יועץ טכנולוגי</w:t>
+            </w:r>
+          </w:p>
+        </w:tc>
+        <w:tc>
+          <w:tcPr>
+            <w:tcW w:type="dxa" w:w="2160"/>
+            <w:vAlign w:val="center"/>
+            <w:shd w:val="clear" w:color="auto" w:fill="E8EEF7"/>
+          </w:tcPr>
+          <w:p>
+            <w:pPr>
+              <w:bidi w:val="1"/>
+              <w:jc w:val="right"/>
+            </w:pPr>
+            <w:r/>
+            <w:r>
+              <w:rPr>
+                <w:rFonts w:ascii="Arial" w:hAnsi="Arial"/>
+                <w:sz w:val="22"/>
+                <w:rtl/>
+              </w:rPr>
+              <w:t>בודק</w:t>
+            </w:r>
+          </w:p>
+        </w:tc>
+      </w:tr>
+      <w:tr>
+        <w:tc>
+          <w:tcPr>
+            <w:tcW w:type="dxa" w:w="2160"/>
+            <w:vAlign w:val="center"/>
+          </w:tcPr>
+          <w:p>
+            <w:pPr>
+              <w:bidi w:val="1"/>
+              <w:jc w:val="right"/>
+            </w:pPr>
+            <w:r/>
+            <w:r>
+              <w:rPr>
+                <w:rFonts w:ascii="Arial" w:hAnsi="Arial"/>
+                <w:sz w:val="22"/>
+                <w:rtl/>
+              </w:rPr>
+              <w:t>{engineer_person}</w:t>
             </w:r>
           </w:p>
         </w:tc>
@@ -427,51 +505,9 @@
               <w:rPr>
                 <w:rFonts w:ascii="Arial" w:hAnsi="Arial"/>
                 <w:sz w:val="22"/>
+                <w:rtl/>
               </w:rPr>
-              <w:t>{consultant_org}</w:t>
-            </w:r>
-          </w:p>
-        </w:tc>
-        <w:tc>
-          <w:tcPr>
-            <w:tcW w:type="dxa" w:w="2160"/>
-            <w:vAlign w:val="center"/>
-          </w:tcPr>
-          <w:p>
-            <w:pPr>
-              <w:bidi w:val="1"/>
-              <w:jc w:val="right"/>
-            </w:pPr>
-            <w:r/>
-            <w:r>
-              <w:rPr>
-                <w:rFonts w:ascii="Arial" w:hAnsi="Arial"/>
-                <w:sz w:val="22"/>
-              </w:rPr>
-              <w:t>{consultant_person}</w:t>
-            </w:r>
-          </w:p>
-        </w:tc>
-      </w:tr>
-      <w:tr>
-        <w:tc>
-          <w:tcPr>
-            <w:tcW w:type="dxa" w:w="2160"/>
-            <w:vAlign w:val="center"/>
-            <w:shd w:val="clear" w:color="auto" w:fill="E8EEF7"/>
-          </w:tcPr>
-          <w:p>
-            <w:pPr>
-              <w:bidi w:val="1"/>
-              <w:jc w:val="right"/>
-            </w:pPr>
-            <w:r/>
-            <w:r>
-              <w:rPr>
-                <w:rFonts w:ascii="Arial" w:hAnsi="Arial"/>
-                <w:sz w:val="22"/>
-              </w:rPr>
-              <w:t>מאשר</w:t>
+              <w:t>{engineer_org}</w:t>
             </w:r>
           </w:p>
         </w:tc>
@@ -491,8 +527,53 @@
               <w:rPr>
                 <w:rFonts w:ascii="Arial" w:hAnsi="Arial"/>
                 <w:sz w:val="22"/>
+                <w:rtl/>
               </w:rPr>
               <w:t>מהנדס טכנולוגי</w:t>
+            </w:r>
+          </w:p>
+        </w:tc>
+        <w:tc>
+          <w:tcPr>
+            <w:tcW w:type="dxa" w:w="2160"/>
+            <w:vAlign w:val="center"/>
+            <w:shd w:val="clear" w:color="auto" w:fill="E8EEF7"/>
+          </w:tcPr>
+          <w:p>
+            <w:pPr>
+              <w:bidi w:val="1"/>
+              <w:jc w:val="right"/>
+            </w:pPr>
+            <w:r/>
+            <w:r>
+              <w:rPr>
+                <w:rFonts w:ascii="Arial" w:hAnsi="Arial"/>
+                <w:sz w:val="22"/>
+                <w:rtl/>
+              </w:rPr>
+              <w:t>מאשר</w:t>
+            </w:r>
+          </w:p>
+        </w:tc>
+      </w:tr>
+      <w:tr>
+        <w:tc>
+          <w:tcPr>
+            <w:tcW w:type="dxa" w:w="2160"/>
+            <w:vAlign w:val="center"/>
+          </w:tcPr>
+          <w:p>
+            <w:pPr>
+              <w:bidi w:val="1"/>
+              <w:jc w:val="right"/>
+            </w:pPr>
+            <w:r/>
+            <w:r>
+              <w:rPr>
+                <w:rFonts w:ascii="Arial" w:hAnsi="Arial"/>
+                <w:sz w:val="22"/>
+                <w:rtl/>
+              </w:rPr>
             </w:r>
           </w:p>
         </w:tc>
@@ -511,51 +592,9 @@
               <w:rPr>
                 <w:rFonts w:ascii="Arial" w:hAnsi="Arial"/>
                 <w:sz w:val="22"/>
+                <w:rtl/>
               </w:rPr>
-              <w:t>{engineer_org}</w:t>
-            </w:r>
-          </w:p>
-        </w:tc>
-        <w:tc>
-          <w:tcPr>
-            <w:tcW w:type="dxa" w:w="2160"/>
-            <w:vAlign w:val="center"/>
-          </w:tcPr>
-          <w:p>
-            <w:pPr>
-              <w:bidi w:val="1"/>
-              <w:jc w:val="right"/>
-            </w:pPr>
-            <w:r/>
-            <w:r>
-              <w:rPr>
-                <w:rFonts w:ascii="Arial" w:hAnsi="Arial"/>
-                <w:sz w:val="22"/>
-              </w:rPr>
-              <w:t>{engineer_person}</w:t>
-            </w:r>
-          </w:p>
-        </w:tc>
-      </w:tr>
-      <w:tr>
-        <w:tc>
-          <w:tcPr>
-            <w:tcW w:type="dxa" w:w="2160"/>
-            <w:vAlign w:val="center"/>
-            <w:shd w:val="clear" w:color="auto" w:fill="E8EEF7"/>
-          </w:tcPr>
-          <w:p>
-            <w:pPr>
-              <w:bidi w:val="1"/>
-              <w:jc w:val="right"/>
-            </w:pPr>
-            <w:r/>
-            <w:r>
-              <w:rPr>
-                <w:rFonts w:ascii="Arial" w:hAnsi="Arial"/>
-                <w:sz w:val="22"/>
-              </w:rPr>
-              <w:t>תאריך</w:t>
+              <w:t>{submit_date}</w:t>
             </w:r>
           </w:p>
         </w:tc>
@@ -575,8 +614,53 @@
               <w:rPr>
                 <w:rFonts w:ascii="Arial" w:hAnsi="Arial"/>
                 <w:sz w:val="22"/>
+                <w:rtl/>
               </w:rPr>
               <w:t>תאריך הגשה</w:t>
+            </w:r>
+          </w:p>
+        </w:tc>
+        <w:tc>
+          <w:tcPr>
+            <w:tcW w:type="dxa" w:w="2160"/>
+            <w:vAlign w:val="center"/>
+            <w:shd w:val="clear" w:color="auto" w:fill="E8EEF7"/>
+          </w:tcPr>
+          <w:p>
+            <w:pPr>
+              <w:bidi w:val="1"/>
+              <w:jc w:val="right"/>
+            </w:pPr>
+            <w:r/>
+            <w:r>
+              <w:rPr>
+                <w:rFonts w:ascii="Arial" w:hAnsi="Arial"/>
+                <w:sz w:val="22"/>
+                <w:rtl/>
+              </w:rPr>
+              <w:t>תאריך</w:t>
+            </w:r>
+          </w:p>
+        </w:tc>
+      </w:tr>
+      <w:tr>
+        <w:tc>
+          <w:tcPr>
+            <w:tcW w:type="dxa" w:w="2160"/>
+            <w:vAlign w:val="center"/>
+          </w:tcPr>
+          <w:p>
+            <w:pPr>
+              <w:bidi w:val="1"/>
+              <w:jc w:val="right"/>
+            </w:pPr>
+            <w:r/>
+            <w:r>
+              <w:rPr>
+                <w:rFonts w:ascii="Arial" w:hAnsi="Arial"/>
+                <w:sz w:val="22"/>
+                <w:rtl/>
+              </w:rPr>
             </w:r>
           </w:p>
         </w:tc>
@@ -595,50 +679,9 @@
               <w:rPr>
                 <w:rFonts w:ascii="Arial" w:hAnsi="Arial"/>
                 <w:sz w:val="22"/>
+                <w:rtl/>
               </w:rPr>
-              <w:t>{submit_date}</w:t>
-            </w:r>
-          </w:p>
-        </w:tc>
-        <w:tc>
-          <w:tcPr>
-            <w:tcW w:type="dxa" w:w="2160"/>
-            <w:vAlign w:val="center"/>
-          </w:tcPr>
-          <w:p>
-            <w:pPr>
-              <w:bidi w:val="1"/>
-              <w:jc w:val="right"/>
-            </w:pPr>
-            <w:r/>
-            <w:r>
-              <w:rPr>
-                <w:rFonts w:ascii="Arial" w:hAnsi="Arial"/>
-                <w:sz w:val="22"/>
-              </w:rPr>
-            </w:r>
-          </w:p>
-        </w:tc>
-      </w:tr>
-      <w:tr>
-        <w:tc>
-          <w:tcPr>
-            <w:tcW w:type="dxa" w:w="2160"/>
-            <w:vAlign w:val="center"/>
-            <w:shd w:val="clear" w:color="auto" w:fill="E8EEF7"/>
-          </w:tcPr>
-          <w:p>
-            <w:pPr>
-              <w:bidi w:val="1"/>
-              <w:jc w:val="right"/>
-            </w:pPr>
-            <w:r/>
-            <w:r>
-              <w:rPr>
-                <w:rFonts w:ascii="Arial" w:hAnsi="Arial"/>
-                <w:sz w:val="22"/>
-              </w:rPr>
-              <w:t>תאריך</w:t>
+              <w:t>{update_date}</w:t>
             </w:r>
           </w:p>
         </w:tc>
@@ -658,6 +701,7 @@
               <w:rPr>
                 <w:rFonts w:ascii="Arial" w:hAnsi="Arial"/>
                 <w:sz w:val="22"/>
+                <w:rtl/>
               </w:rPr>
               <w:t>תאריך עדכון</w:t>
             </w:r>
@@ -667,6 +711,7 @@
           <w:tcPr>
             <w:tcW w:type="dxa" w:w="2160"/>
             <w:vAlign w:val="center"/>
+            <w:shd w:val="clear" w:color="auto" w:fill="E8EEF7"/>
           </w:tcPr>
           <w:p>
             <w:pPr>
@@ -678,27 +723,9 @@
               <w:rPr>
                 <w:rFonts w:ascii="Arial" w:hAnsi="Arial"/>
                 <w:sz w:val="22"/>
+                <w:rtl/>
               </w:rPr>
-              <w:t>{update_date}</w:t>
-            </w:r>
-          </w:p>
-        </w:tc>
-        <w:tc>
-          <w:tcPr>
-            <w:tcW w:type="dxa" w:w="2160"/>
-            <w:vAlign w:val="center"/>
-          </w:tcPr>
-          <w:p>
-            <w:pPr>
-              <w:bidi w:val="1"/>
-              <w:jc w:val="right"/>
-            </w:pPr>
-            <w:r/>
-            <w:r>
-              <w:rPr>
-                <w:rFonts w:ascii="Arial" w:hAnsi="Arial"/>
-                <w:sz w:val="22"/>
-              </w:rPr>
+              <w:t>תאריך</w:t>
             </w:r>
           </w:p>
         </w:tc>
@@ -989,7 +1016,6 @@
         <w:tblStyle w:val="LightGrid-Accent1"/>
         <w:tblW w:type="auto" w:w="0"/>
         <w:tblLook w:firstColumn="1" w:firstRow="1" w:lastColumn="0" w:lastRow="0" w:noHBand="0" w:noVBand="1" w:val="04A0"/>
-        <w:bidiVisual w:val="1"/>
       </w:tblPr>
       <w:tblGrid>
         <w:gridCol w:w="1234"/>
@@ -1022,8 +1048,9 @@
                 <w:b/>
                 <w:color w:val="FFFFFF"/>
                 <w:sz w:val="20"/>
+                <w:rtl/>
               </w:rPr>
-              <w:t>מס"ד</w:t>
+              <w:t>מיקום בתכנית</w:t>
             </w:r>
           </w:p>
         </w:tc>
@@ -1048,6 +1075,115 @@
                 <w:b/>
                 <w:color w:val="FFFFFF"/>
                 <w:sz w:val="20"/>
+                <w:rtl/>
+              </w:rPr>
+              <w:t>כתובת IP</w:t>
+            </w:r>
+          </w:p>
+        </w:tc>
+        <w:tc>
+          <w:tcPr>
+            <w:tcW w:type="dxa" w:w="1234"/>
+            <w:shd w:val="clear" w:color="auto" w:fill="1A2A4A"/>
+          </w:tcPr>
+          <w:p>
+            <w:pPr>
+              <w:bidi w:val="1"/>
+              <w:jc w:val="center"/>
+            </w:pPr>
+            <w:r>
+              <w:rPr>
+                <w:color w:val="FFFFFF"/>
+              </w:rPr>
+            </w:r>
+            <w:r>
+              <w:rPr>
+                <w:rFonts w:ascii="Arial" w:hAnsi="Arial"/>
+                <w:b/>
+                <w:color w:val="FFFFFF"/>
+                <w:sz w:val="20"/>
+                <w:rtl/>
+              </w:rPr>
+              <w:t>פורט בפנל</w:t>
+            </w:r>
+          </w:p>
+        </w:tc>
+        <w:tc>
+          <w:tcPr>
+            <w:tcW w:type="dxa" w:w="1234"/>
+            <w:shd w:val="clear" w:color="auto" w:fill="1A2A4A"/>
+          </w:tcPr>
+          <w:p>
+            <w:pPr>
+              <w:bidi w:val="1"/>
+              <w:jc w:val="center"/>
+            </w:pPr>
+            <w:r>
+              <w:rPr>
+                <w:color w:val="FFFFFF"/>
+              </w:rPr>
+            </w:r>
+            <w:r>
+              <w:rPr>
+                <w:rFonts w:ascii="Arial" w:hAnsi="Arial"/>
+                <w:b/>
+                <w:color w:val="FFFFFF"/>
+                <w:sz w:val="20"/>
+                <w:rtl/>
+              </w:rPr>
+              <w:t>סוג מצלמה</w:t>
+            </w:r>
+          </w:p>
+        </w:tc>
+        <w:tc>
+          <w:tcPr>
+            <w:tcW w:type="dxa" w:w="1234"/>
+            <w:shd w:val="clear" w:color="auto" w:fill="1A2A4A"/>
+          </w:tcPr>
+          <w:p>
+            <w:pPr>
+              <w:bidi w:val="1"/>
+              <w:jc w:val="center"/>
+            </w:pPr>
+            <w:r>
+              <w:rPr>
+                <w:color w:val="FFFFFF"/>
+              </w:rPr>
+            </w:r>
+            <w:r>
+              <w:rPr>
+                <w:rFonts w:ascii="Arial" w:hAnsi="Arial"/>
+                <w:b/>
+                <w:color w:val="FFFFFF"/>
+                <w:sz w:val="20"/>
+                <w:rtl/>
+              </w:rPr>
+              <w:t>שם המצלמה</w:t>
+            </w:r>
+          </w:p>
+        </w:tc>
+        <w:tc>
+          <w:tcPr>
+            <w:tcW w:type="dxa" w:w="1234"/>
+            <w:shd w:val="clear" w:color="auto" w:fill="1A2A4A"/>
+          </w:tcPr>
+          <w:p>
+            <w:pPr>
+              <w:bidi w:val="1"/>
+              <w:jc w:val="center"/>
+            </w:pPr>
+            <w:r>
+              <w:rPr>
+                <w:color w:val="FFFFFF"/>
+              </w:rPr>
+            </w:r>
+            <w:r>
+              <w:rPr>
+                <w:rFonts w:ascii="Arial" w:hAnsi="Arial"/>
+                <w:b/>
+                <w:color w:val="FFFFFF"/>
+                <w:sz w:val="20"/>
+                <w:rtl/>
               </w:rPr>
               <w:t>ארון תקשורת</w:t>
             </w:r>
@@ -1074,112 +1210,9 @@
                 <w:b/>
                 <w:color w:val="FFFFFF"/>
                 <w:sz w:val="20"/>
+                <w:rtl/>
               </w:rPr>
-              <w:t>שם המצלמה</w:t>
-            </w:r>
-          </w:p>
-        </w:tc>
-        <w:tc>
-          <w:tcPr>
-            <w:tcW w:type="dxa" w:w="1234"/>
-            <w:shd w:val="clear" w:color="auto" w:fill="1A2A4A"/>
-          </w:tcPr>
-          <w:p>
-            <w:pPr>
-              <w:bidi w:val="1"/>
-              <w:jc w:val="center"/>
-            </w:pPr>
-            <w:r>
-              <w:rPr>
-                <w:color w:val="FFFFFF"/>
-              </w:rPr>
-            </w:r>
-            <w:r>
-              <w:rPr>
-                <w:rFonts w:ascii="Arial" w:hAnsi="Arial"/>
-                <w:b/>
-                <w:color w:val="FFFFFF"/>
-                <w:sz w:val="20"/>
-              </w:rPr>
-              <w:t>סוג מצלמה</w:t>
-            </w:r>
-          </w:p>
-        </w:tc>
-        <w:tc>
-          <w:tcPr>
-            <w:tcW w:type="dxa" w:w="1234"/>
-            <w:shd w:val="clear" w:color="auto" w:fill="1A2A4A"/>
-          </w:tcPr>
-          <w:p>
-            <w:pPr>
-              <w:bidi w:val="1"/>
-              <w:jc w:val="center"/>
-            </w:pPr>
-            <w:r>
-              <w:rPr>
-                <w:color w:val="FFFFFF"/>
-              </w:rPr>
-            </w:r>
-            <w:r>
-              <w:rPr>
-                <w:rFonts w:ascii="Arial" w:hAnsi="Arial"/>
-                <w:b/>
-                <w:color w:val="FFFFFF"/>
-                <w:sz w:val="20"/>
-              </w:rPr>
-              <w:t>פורט בפנל</w:t>
-            </w:r>
-          </w:p>
-        </w:tc>
-        <w:tc>
-          <w:tcPr>
-            <w:tcW w:type="dxa" w:w="1234"/>
-            <w:shd w:val="clear" w:color="auto" w:fill="1A2A4A"/>
-          </w:tcPr>
-          <w:p>
-            <w:pPr>
-              <w:bidi w:val="1"/>
-              <w:jc w:val="center"/>
-            </w:pPr>
-            <w:r>
-              <w:rPr>
-                <w:color w:val="FFFFFF"/>
-              </w:rPr>
-            </w:r>
-            <w:r>
-              <w:rPr>
-                <w:rFonts w:ascii="Arial" w:hAnsi="Arial"/>
-                <w:b/>
-                <w:color w:val="FFFFFF"/>
-                <w:sz w:val="20"/>
-              </w:rPr>
-              <w:t>כתובת IP</w:t>
-            </w:r>
-          </w:p>
-        </w:tc>
-        <w:tc>
-          <w:tcPr>
-            <w:tcW w:type="dxa" w:w="1234"/>
-            <w:shd w:val="clear" w:color="auto" w:fill="1A2A4A"/>
-          </w:tcPr>
-          <w:p>
-            <w:pPr>
-              <w:bidi w:val="1"/>
-              <w:jc w:val="center"/>
-            </w:pPr>
-            <w:r>
-              <w:rPr>
-                <w:color w:val="FFFFFF"/>
-              </w:rPr>
-            </w:r>
-            <w:r>
-              <w:rPr>
-                <w:rFonts w:ascii="Arial" w:hAnsi="Arial"/>
-                <w:b/>
-                <w:color w:val="FFFFFF"/>
-                <w:sz w:val="20"/>
-              </w:rPr>
-              <w:t>מיקום בתכנית</w:t>
+              <w:t>מס"ד</w:t>
             </w:r>
           </w:p>
         </w:tc>
@@ -1199,8 +1232,9 @@
               <w:rPr>
                 <w:rFonts w:ascii="Arial" w:hAnsi="Arial"/>
                 <w:sz w:val="20"/>
+                <w:rtl/>
               </w:rPr>
-              <w:t>{#cameras}{idx}</w:t>
+              <w:t>{#cameras}{location}</w:t>
             </w:r>
           </w:p>
         </w:tc>
@@ -1218,6 +1252,87 @@
               <w:rPr>
                 <w:rFonts w:ascii="Arial" w:hAnsi="Arial"/>
                 <w:sz w:val="20"/>
+                <w:rtl/>
+              </w:rPr>
+              <w:t>{ip}</w:t>
+            </w:r>
+          </w:p>
+        </w:tc>
+        <w:tc>
+          <w:tcPr>
+            <w:tcW w:type="dxa" w:w="1234"/>
+          </w:tcPr>
+          <w:p>
+            <w:pPr>
+              <w:bidi w:val="1"/>
+              <w:jc w:val="center"/>
+            </w:pPr>
+            <w:r/>
+            <w:r>
+              <w:rPr>
+                <w:rFonts w:ascii="Arial" w:hAnsi="Arial"/>
+                <w:sz w:val="20"/>
+                <w:rtl/>
+              </w:rPr>
+              <w:t>{port}</w:t>
+            </w:r>
+          </w:p>
+        </w:tc>
+        <w:tc>
+          <w:tcPr>
+            <w:tcW w:type="dxa" w:w="1234"/>
+          </w:tcPr>
+          <w:p>
+            <w:pPr>
+              <w:bidi w:val="1"/>
+              <w:jc w:val="center"/>
+            </w:pPr>
+            <w:r/>
+            <w:r>
+              <w:rPr>
+                <w:rFonts w:ascii="Arial" w:hAnsi="Arial"/>
+                <w:sz w:val="20"/>
+                <w:rtl/>
+              </w:rPr>
+              <w:t>{model}</w:t>
+            </w:r>
+          </w:p>
+        </w:tc>
+        <w:tc>
+          <w:tcPr>
+            <w:tcW w:type="dxa" w:w="1234"/>
+          </w:tcPr>
+          <w:p>
+            <w:pPr>
+              <w:bidi w:val="1"/>
+              <w:jc w:val="center"/>
+            </w:pPr>
+            <w:r/>
+            <w:r>
+              <w:rPr>
+                <w:rFonts w:ascii="Arial" w:hAnsi="Arial"/>
+                <w:sz w:val="20"/>
+                <w:rtl/>
+              </w:rPr>
+              <w:t>{name}</w:t>
+            </w:r>
+          </w:p>
+        </w:tc>
+        <w:tc>
+          <w:tcPr>
+            <w:tcW w:type="dxa" w:w="1234"/>
+          </w:tcPr>
+          <w:p>
+            <w:pPr>
+              <w:bidi w:val="1"/>
+              <w:jc w:val="center"/>
+            </w:pPr>
+            <w:r/>
+            <w:r>
+              <w:rPr>
+                <w:rFonts w:ascii="Arial" w:hAnsi="Arial"/>
+                <w:sz w:val="20"/>
+                <w:rtl/>
               </w:rPr>
               <w:t>{cabinet}</w:t>
             </w:r>
@@ -1237,84 +1352,9 @@
               <w:rPr>
                 <w:rFonts w:ascii="Arial" w:hAnsi="Arial"/>
                 <w:sz w:val="20"/>
+                <w:rtl/>
               </w:rPr>
-              <w:t>{name}</w:t>
-            </w:r>
-          </w:p>
-        </w:tc>
-        <w:tc>
-          <w:tcPr>
-            <w:tcW w:type="dxa" w:w="1234"/>
-          </w:tcPr>
-          <w:p>
-            <w:pPr>
-              <w:bidi w:val="1"/>
-              <w:jc w:val="center"/>
-            </w:pPr>
-            <w:r/>
-            <w:r>
-              <w:rPr>
-                <w:rFonts w:ascii="Arial" w:hAnsi="Arial"/>
-                <w:sz w:val="20"/>
-              </w:rPr>
-              <w:t>{model}</w:t>
-            </w:r>
-          </w:p>
-        </w:tc>
-        <w:tc>
-          <w:tcPr>
-            <w:tcW w:type="dxa" w:w="1234"/>
-          </w:tcPr>
-          <w:p>
-            <w:pPr>
-              <w:bidi w:val="1"/>
-              <w:jc w:val="center"/>
-            </w:pPr>
-            <w:r/>
-            <w:r>
-              <w:rPr>
-                <w:rFonts w:ascii="Arial" w:hAnsi="Arial"/>
-                <w:sz w:val="20"/>
-              </w:rPr>
-              <w:t>{port}</w:t>
-            </w:r>
-          </w:p>
-        </w:tc>
-        <w:tc>
-          <w:tcPr>
-            <w:tcW w:type="dxa" w:w="1234"/>
-          </w:tcPr>
-          <w:p>
-            <w:pPr>
-              <w:bidi w:val="1"/>
-              <w:jc w:val="center"/>
-            </w:pPr>
-            <w:r/>
-            <w:r>
-              <w:rPr>
-                <w:rFonts w:ascii="Arial" w:hAnsi="Arial"/>
-                <w:sz w:val="20"/>
-              </w:rPr>
-              <w:t>{ip}</w:t>
-            </w:r>
-          </w:p>
-        </w:tc>
-        <w:tc>
-          <w:tcPr>
-            <w:tcW w:type="dxa" w:w="1234"/>
-          </w:tcPr>
-          <w:p>
-            <w:pPr>
-              <w:bidi w:val="1"/>
-              <w:jc w:val="center"/>
-            </w:pPr>
-            <w:r/>
-            <w:r>
-              <w:rPr>
-                <w:rFonts w:ascii="Arial" w:hAnsi="Arial"/>
-                <w:sz w:val="20"/>
-              </w:rPr>
-              <w:t>{location}{/cameras}</w:t>
+              <w:t>{idx}{/cameras}</w:t>
             </w:r>
           </w:p>
         </w:tc>
@@ -1344,7 +1384,6 @@
         <w:tblStyle w:val="LightGrid-Accent1"/>
         <w:tblW w:type="auto" w:w="0"/>
         <w:tblLook w:firstColumn="1" w:firstRow="1" w:lastColumn="0" w:lastRow="0" w:noHBand="0" w:noVBand="1" w:val="04A0"/>
-        <w:bidiVisual w:val="1"/>
       </w:tblPr>
       <w:tblGrid>
         <w:gridCol w:w="1440"/>
@@ -1376,8 +1415,9 @@
                 <w:b/>
                 <w:color w:val="FFFFFF"/>
                 <w:sz w:val="20"/>
+                <w:rtl/>
               </w:rPr>
-              <w:t>מס"ד</w:t>
+              <w:t>כתובת IP</w:t>
             </w:r>
           </w:p>
         </w:tc>
@@ -1402,6 +1442,88 @@
                 <w:b/>
                 <w:color w:val="FFFFFF"/>
                 <w:sz w:val="20"/>
+                <w:rtl/>
+              </w:rPr>
+              <w:t>מיקום</w:t>
+            </w:r>
+          </w:p>
+        </w:tc>
+        <w:tc>
+          <w:tcPr>
+            <w:tcW w:type="dxa" w:w="1440"/>
+            <w:shd w:val="clear" w:color="auto" w:fill="1A2A4A"/>
+          </w:tcPr>
+          <w:p>
+            <w:pPr>
+              <w:bidi w:val="1"/>
+              <w:jc w:val="center"/>
+            </w:pPr>
+            <w:r>
+              <w:rPr>
+                <w:color w:val="FFFFFF"/>
+              </w:rPr>
+            </w:r>
+            <w:r>
+              <w:rPr>
+                <w:rFonts w:ascii="Arial" w:hAnsi="Arial"/>
+                <w:b/>
+                <w:color w:val="FFFFFF"/>
+                <w:sz w:val="20"/>
+                <w:rtl/>
+              </w:rPr>
+              <w:t>יצרן</w:t>
+            </w:r>
+          </w:p>
+        </w:tc>
+        <w:tc>
+          <w:tcPr>
+            <w:tcW w:type="dxa" w:w="1440"/>
+            <w:shd w:val="clear" w:color="auto" w:fill="1A2A4A"/>
+          </w:tcPr>
+          <w:p>
+            <w:pPr>
+              <w:bidi w:val="1"/>
+              <w:jc w:val="center"/>
+            </w:pPr>
+            <w:r>
+              <w:rPr>
+                <w:color w:val="FFFFFF"/>
+              </w:rPr>
+            </w:r>
+            <w:r>
+              <w:rPr>
+                <w:rFonts w:ascii="Arial" w:hAnsi="Arial"/>
+                <w:b/>
+                <w:color w:val="FFFFFF"/>
+                <w:sz w:val="20"/>
+                <w:rtl/>
+              </w:rPr>
+              <w:t>מק"ט</w:t>
+            </w:r>
+          </w:p>
+        </w:tc>
+        <w:tc>
+          <w:tcPr>
+            <w:tcW w:type="dxa" w:w="1440"/>
+            <w:shd w:val="clear" w:color="auto" w:fill="1A2A4A"/>
+          </w:tcPr>
+          <w:p>
+            <w:pPr>
+              <w:bidi w:val="1"/>
+              <w:jc w:val="center"/>
+            </w:pPr>
+            <w:r>
+              <w:rPr>
+                <w:color w:val="FFFFFF"/>
+              </w:rPr>
+            </w:r>
+            <w:r>
+              <w:rPr>
+                <w:rFonts w:ascii="Arial" w:hAnsi="Arial"/>
+                <w:b/>
+                <w:color w:val="FFFFFF"/>
+                <w:sz w:val="20"/>
+                <w:rtl/>
               </w:rPr>
               <w:t>סוג עורק</w:t>
             </w:r>
@@ -1428,86 +1550,9 @@
                 <w:b/>
                 <w:color w:val="FFFFFF"/>
                 <w:sz w:val="20"/>
+                <w:rtl/>
               </w:rPr>
-              <w:t>מק"ט</w:t>
-            </w:r>
-          </w:p>
-        </w:tc>
-        <w:tc>
-          <w:tcPr>
-            <w:tcW w:type="dxa" w:w="1440"/>
-            <w:shd w:val="clear" w:color="auto" w:fill="1A2A4A"/>
-          </w:tcPr>
-          <w:p>
-            <w:pPr>
-              <w:bidi w:val="1"/>
-              <w:jc w:val="center"/>
-            </w:pPr>
-            <w:r>
-              <w:rPr>
-                <w:color w:val="FFFFFF"/>
-              </w:rPr>
-            </w:r>
-            <w:r>
-              <w:rPr>
-                <w:rFonts w:ascii="Arial" w:hAnsi="Arial"/>
-                <w:b/>
-                <w:color w:val="FFFFFF"/>
-                <w:sz w:val="20"/>
-              </w:rPr>
-              <w:t>יצרן</w:t>
-            </w:r>
-          </w:p>
-        </w:tc>
-        <w:tc>
-          <w:tcPr>
-            <w:tcW w:type="dxa" w:w="1440"/>
-            <w:shd w:val="clear" w:color="auto" w:fill="1A2A4A"/>
-          </w:tcPr>
-          <w:p>
-            <w:pPr>
-              <w:bidi w:val="1"/>
-              <w:jc w:val="center"/>
-            </w:pPr>
-            <w:r>
-              <w:rPr>
-                <w:color w:val="FFFFFF"/>
-              </w:rPr>
-            </w:r>
-            <w:r>
-              <w:rPr>
-                <w:rFonts w:ascii="Arial" w:hAnsi="Arial"/>
-                <w:b/>
-                <w:color w:val="FFFFFF"/>
-                <w:sz w:val="20"/>
-              </w:rPr>
-              <w:t>מיקום</w:t>
-            </w:r>
-          </w:p>
-        </w:tc>
-        <w:tc>
-          <w:tcPr>
-            <w:tcW w:type="dxa" w:w="1440"/>
-            <w:shd w:val="clear" w:color="auto" w:fill="1A2A4A"/>
-          </w:tcPr>
-          <w:p>
-            <w:pPr>
-              <w:bidi w:val="1"/>
-              <w:jc w:val="center"/>
-            </w:pPr>
-            <w:r>
-              <w:rPr>
-                <w:color w:val="FFFFFF"/>
-              </w:rPr>
-            </w:r>
-            <w:r>
-              <w:rPr>
-                <w:rFonts w:ascii="Arial" w:hAnsi="Arial"/>
-                <w:b/>
-                <w:color w:val="FFFFFF"/>
-                <w:sz w:val="20"/>
-              </w:rPr>
-              <w:t>כתובת IP</w:t>
+              <w:t>מס"ד</w:t>
             </w:r>
           </w:p>
         </w:tc>
@@ -1527,8 +1572,9 @@
               <w:rPr>
                 <w:rFonts w:ascii="Arial" w:hAnsi="Arial"/>
                 <w:sz w:val="20"/>
+                <w:rtl/>
               </w:rPr>
-              <w:t>{#backhauls}{idx}</w:t>
+              <w:t>{#backhauls}{ip}</w:t>
             </w:r>
           </w:p>
         </w:tc>
@@ -1546,6 +1592,67 @@
               <w:rPr>
                 <w:rFonts w:ascii="Arial" w:hAnsi="Arial"/>
                 <w:sz w:val="20"/>
+                <w:rtl/>
+              </w:rPr>
+              <w:t>{location}</w:t>
+            </w:r>
+          </w:p>
+        </w:tc>
+        <w:tc>
+          <w:tcPr>
+            <w:tcW w:type="dxa" w:w="1440"/>
+          </w:tcPr>
+          <w:p>
+            <w:pPr>
+              <w:bidi w:val="1"/>
+              <w:jc w:val="center"/>
+            </w:pPr>
+            <w:r/>
+            <w:r>
+              <w:rPr>
+                <w:rFonts w:ascii="Arial" w:hAnsi="Arial"/>
+                <w:sz w:val="20"/>
+                <w:rtl/>
+              </w:rPr>
+              <w:t>{vendor}</w:t>
+            </w:r>
+          </w:p>
+        </w:tc>
+        <w:tc>
+          <w:tcPr>
+            <w:tcW w:type="dxa" w:w="1440"/>
+          </w:tcPr>
+          <w:p>
+            <w:pPr>
+              <w:bidi w:val="1"/>
+              <w:jc w:val="center"/>
+            </w:pPr>
+            <w:r/>
+            <w:r>
+              <w:rPr>
+                <w:rFonts w:ascii="Arial" w:hAnsi="Arial"/>
+                <w:sz w:val="20"/>
+                <w:rtl/>
+              </w:rPr>
+              <w:t>{mpn}</w:t>
+            </w:r>
+          </w:p>
+        </w:tc>
+        <w:tc>
+          <w:tcPr>
+            <w:tcW w:type="dxa" w:w="1440"/>
+          </w:tcPr>
+          <w:p>
+            <w:pPr>
+              <w:bidi w:val="1"/>
+              <w:jc w:val="center"/>
+            </w:pPr>
+            <w:r/>
+            <w:r>
+              <w:rPr>
+                <w:rFonts w:ascii="Arial" w:hAnsi="Arial"/>
+                <w:sz w:val="20"/>
+                <w:rtl/>
               </w:rPr>
               <w:t>{type}</w:t>
             </w:r>
@@ -1565,65 +1672,9 @@
               <w:rPr>
                 <w:rFonts w:ascii="Arial" w:hAnsi="Arial"/>
                 <w:sz w:val="20"/>
+                <w:rtl/>
               </w:rPr>
-              <w:t>{mpn}</w:t>
-            </w:r>
-          </w:p>
-        </w:tc>
-        <w:tc>
-          <w:tcPr>
-            <w:tcW w:type="dxa" w:w="1440"/>
-          </w:tcPr>
-          <w:p>
-            <w:pPr>
-              <w:bidi w:val="1"/>
-              <w:jc w:val="center"/>
-            </w:pPr>
-            <w:r/>
-            <w:r>
-              <w:rPr>
-                <w:rFonts w:ascii="Arial" w:hAnsi="Arial"/>
-                <w:sz w:val="20"/>
-              </w:rPr>
-              <w:t>{vendor}</w:t>
-            </w:r>
-          </w:p>
-        </w:tc>
-        <w:tc>
-          <w:tcPr>
-            <w:tcW w:type="dxa" w:w="1440"/>
-          </w:tcPr>
-          <w:p>
-            <w:pPr>
-              <w:bidi w:val="1"/>
-              <w:jc w:val="center"/>
-            </w:pPr>
-            <w:r/>
-            <w:r>
-              <w:rPr>
-                <w:rFonts w:ascii="Arial" w:hAnsi="Arial"/>
-                <w:sz w:val="20"/>
-              </w:rPr>
-              <w:t>{location}</w:t>
-            </w:r>
-          </w:p>
-        </w:tc>
-        <w:tc>
-          <w:tcPr>
-            <w:tcW w:type="dxa" w:w="1440"/>
-          </w:tcPr>
-          <w:p>
-            <w:pPr>
-              <w:bidi w:val="1"/>
-              <w:jc w:val="center"/>
-            </w:pPr>
-            <w:r/>
-            <w:r>
-              <w:rPr>
-                <w:rFonts w:ascii="Arial" w:hAnsi="Arial"/>
-                <w:sz w:val="20"/>
-              </w:rPr>
-              <w:t>{ip}{/backhauls}</w:t>
+              <w:t>{idx}{/backhauls}</w:t>
             </w:r>
           </w:p>
         </w:tc>
@@ -1653,7 +1704,6 @@
         <w:tblStyle w:val="LightGrid-Accent1"/>
         <w:tblW w:type="auto" w:w="0"/>
         <w:tblLook w:firstColumn="1" w:firstRow="1" w:lastColumn="0" w:lastRow="0" w:noHBand="0" w:noVBand="1" w:val="04A0"/>
-        <w:bidiVisual w:val="1"/>
       </w:tblPr>
       <w:tblGrid>
         <w:gridCol w:w="1728"/>
@@ -1684,8 +1734,9 @@
                 <w:b/>
                 <w:color w:val="FFFFFF"/>
                 <w:sz w:val="20"/>
+                <w:rtl/>
               </w:rPr>
-              <w:t>מס"ד</w:t>
+              <w:t>כתובת IP</w:t>
             </w:r>
           </w:p>
         </w:tc>
@@ -1710,6 +1761,61 @@
                 <w:b/>
                 <w:color w:val="FFFFFF"/>
                 <w:sz w:val="20"/>
+                <w:rtl/>
+              </w:rPr>
+              <w:t>יצרן</w:t>
+            </w:r>
+          </w:p>
+        </w:tc>
+        <w:tc>
+          <w:tcPr>
+            <w:tcW w:type="dxa" w:w="1728"/>
+            <w:shd w:val="clear" w:color="auto" w:fill="1A2A4A"/>
+          </w:tcPr>
+          <w:p>
+            <w:pPr>
+              <w:bidi w:val="1"/>
+              <w:jc w:val="center"/>
+            </w:pPr>
+            <w:r>
+              <w:rPr>
+                <w:color w:val="FFFFFF"/>
+              </w:rPr>
+            </w:r>
+            <w:r>
+              <w:rPr>
+                <w:rFonts w:ascii="Arial" w:hAnsi="Arial"/>
+                <w:b/>
+                <w:color w:val="FFFFFF"/>
+                <w:sz w:val="20"/>
+                <w:rtl/>
+              </w:rPr>
+              <w:t>מק"ט</w:t>
+            </w:r>
+          </w:p>
+        </w:tc>
+        <w:tc>
+          <w:tcPr>
+            <w:tcW w:type="dxa" w:w="1728"/>
+            <w:shd w:val="clear" w:color="auto" w:fill="1A2A4A"/>
+          </w:tcPr>
+          <w:p>
+            <w:pPr>
+              <w:bidi w:val="1"/>
+              <w:jc w:val="center"/>
+            </w:pPr>
+            <w:r>
+              <w:rPr>
+                <w:color w:val="FFFFFF"/>
+              </w:rPr>
+            </w:r>
+            <w:r>
+              <w:rPr>
+                <w:rFonts w:ascii="Arial" w:hAnsi="Arial"/>
+                <w:b/>
+                <w:color w:val="FFFFFF"/>
+                <w:sz w:val="20"/>
+                <w:rtl/>
               </w:rPr>
               <w:t>מתגים</w:t>
             </w:r>
@@ -1736,60 +1842,9 @@
                 <w:b/>
                 <w:color w:val="FFFFFF"/>
                 <w:sz w:val="20"/>
+                <w:rtl/>
               </w:rPr>
-              <w:t>מק"ט</w:t>
-            </w:r>
-          </w:p>
-        </w:tc>
-        <w:tc>
-          <w:tcPr>
-            <w:tcW w:type="dxa" w:w="1728"/>
-            <w:shd w:val="clear" w:color="auto" w:fill="1A2A4A"/>
-          </w:tcPr>
-          <w:p>
-            <w:pPr>
-              <w:bidi w:val="1"/>
-              <w:jc w:val="center"/>
-            </w:pPr>
-            <w:r>
-              <w:rPr>
-                <w:color w:val="FFFFFF"/>
-              </w:rPr>
-            </w:r>
-            <w:r>
-              <w:rPr>
-                <w:rFonts w:ascii="Arial" w:hAnsi="Arial"/>
-                <w:b/>
-                <w:color w:val="FFFFFF"/>
-                <w:sz w:val="20"/>
-              </w:rPr>
-              <w:t>יצרן</w:t>
-            </w:r>
-          </w:p>
-        </w:tc>
-        <w:tc>
-          <w:tcPr>
-            <w:tcW w:type="dxa" w:w="1728"/>
-            <w:shd w:val="clear" w:color="auto" w:fill="1A2A4A"/>
-          </w:tcPr>
-          <w:p>
-            <w:pPr>
-              <w:bidi w:val="1"/>
-              <w:jc w:val="center"/>
-            </w:pPr>
-            <w:r>
-              <w:rPr>
-                <w:color w:val="FFFFFF"/>
-              </w:rPr>
-            </w:r>
-            <w:r>
-              <w:rPr>
-                <w:rFonts w:ascii="Arial" w:hAnsi="Arial"/>
-                <w:b/>
-                <w:color w:val="FFFFFF"/>
-                <w:sz w:val="20"/>
-              </w:rPr>
-              <w:t>כתובת IP</w:t>
+              <w:t>מס"ד</w:t>
             </w:r>
           </w:p>
         </w:tc>
@@ -1809,8 +1864,9 @@
               <w:rPr>
                 <w:rFonts w:ascii="Arial" w:hAnsi="Arial"/>
                 <w:sz w:val="20"/>
+                <w:rtl/>
               </w:rPr>
-              <w:t>{#switches}{idx}</w:t>
+              <w:t>{#switches}{ip}</w:t>
             </w:r>
           </w:p>
         </w:tc>
@@ -1828,6 +1884,47 @@
               <w:rPr>
                 <w:rFonts w:ascii="Arial" w:hAnsi="Arial"/>
                 <w:sz w:val="20"/>
+                <w:rtl/>
+              </w:rPr>
+              <w:t>{vendor}</w:t>
+            </w:r>
+          </w:p>
+        </w:tc>
+        <w:tc>
+          <w:tcPr>
+            <w:tcW w:type="dxa" w:w="1728"/>
+          </w:tcPr>
+          <w:p>
+            <w:pPr>
+              <w:bidi w:val="1"/>
+              <w:jc w:val="center"/>
+            </w:pPr>
+            <w:r/>
+            <w:r>
+              <w:rPr>
+                <w:rFonts w:ascii="Arial" w:hAnsi="Arial"/>
+                <w:sz w:val="20"/>
+                <w:rtl/>
+              </w:rPr>
+              <w:t>{mpn}</w:t>
+            </w:r>
+          </w:p>
+        </w:tc>
+        <w:tc>
+          <w:tcPr>
+            <w:tcW w:type="dxa" w:w="1728"/>
+          </w:tcPr>
+          <w:p>
+            <w:pPr>
+              <w:bidi w:val="1"/>
+              <w:jc w:val="center"/>
+            </w:pPr>
+            <w:r/>
+            <w:r>
+              <w:rPr>
+                <w:rFonts w:ascii="Arial" w:hAnsi="Arial"/>
+                <w:sz w:val="20"/>
+                <w:rtl/>
               </w:rPr>
               <w:t>{name}</w:t>
             </w:r>
@@ -1847,46 +1944,9 @@
               <w:rPr>
                 <w:rFonts w:ascii="Arial" w:hAnsi="Arial"/>
                 <w:sz w:val="20"/>
+                <w:rtl/>
               </w:rPr>
-              <w:t>{mpn}</w:t>
-            </w:r>
-          </w:p>
-        </w:tc>
-        <w:tc>
-          <w:tcPr>
-            <w:tcW w:type="dxa" w:w="1728"/>
-          </w:tcPr>
-          <w:p>
-            <w:pPr>
-              <w:bidi w:val="1"/>
-              <w:jc w:val="center"/>
-            </w:pPr>
-            <w:r/>
-            <w:r>
-              <w:rPr>
-                <w:rFonts w:ascii="Arial" w:hAnsi="Arial"/>
-                <w:sz w:val="20"/>
-              </w:rPr>
-              <w:t>{vendor}</w:t>
-            </w:r>
-          </w:p>
-        </w:tc>
-        <w:tc>
-          <w:tcPr>
-            <w:tcW w:type="dxa" w:w="1728"/>
-          </w:tcPr>
-          <w:p>
-            <w:pPr>
-              <w:bidi w:val="1"/>
-              <w:jc w:val="center"/>
-            </w:pPr>
-            <w:r/>
-            <w:r>
-              <w:rPr>
-                <w:rFonts w:ascii="Arial" w:hAnsi="Arial"/>
-                <w:sz w:val="20"/>
-              </w:rPr>
-              <w:t>{ip}{/switches}</w:t>
+              <w:t>{idx}{/switches}</w:t>
             </w:r>
           </w:p>
         </w:tc>

</xml_diff>

<commit_message>
Fix scope_items bullets merging into single line in Word export
The {#scope_items}{text}{/scope_items} loop was an inline loop (opener and
closer in the same paragraph), so docxtemplater paragraphLoop:true could not
split each item into its own paragraph — all bullet text was concatenated
into a single line.

Fixed the cctv.docx template so the loop opener/closer are in their own
paragraphs, and the ListBullet content paragraph is cloned per item.
Each scope item now produces a separate RTL bullet in the exported Word file.

Co-Authored-By: Claude Sonnet 4.6 <noreply@anthropic.com>
</commit_message>
<xml_diff>
--- a/templates/cctv.docx
+++ b/templates/cctv.docx
@@ -783,6 +783,14 @@
     </w:p>
     <w:p>
       <w:pPr>
+        <w:bidi w:val="1"/>
+      </w:pPr>
+      <w:r>
+        <w:t>{#scope_items}</w:t>
+      </w:r>
+    </w:p>
+    <w:p>
+      <w:pPr>
         <w:pStyle w:val="ListBullet"/>
         <w:bidi w:val="1"/>
         <w:jc w:val="right"/>
@@ -792,7 +800,15 @@
           <w:rFonts w:ascii="Arial" w:hAnsi="Arial"/>
           <w:rtl/>
         </w:rPr>
-        <w:t>{#scope_items}{text}{/scope_items}</w:t>
+        <w:t>{text}</w:t>
+      </w:r>
+    </w:p>
+    <w:p>
+      <w:pPr>
+        <w:bidi w:val="1"/>
+      </w:pPr>
+      <w:r>
+        <w:t>{/scope_items}</w:t>
       </w:r>
     </w:p>
     <w:p>

</xml_diff>

<commit_message>
fix(docpack): compact datasheet pages — zero spacing on image paragraphs
The Normal style upgrade (space_after=6pt, line_spacing=1.15) was
inherited by {%page_img} paragraphs, adding ~6-8pt of empty whitespace
between every PDF page rendered as an image. On a letter/A4 page this
accumulated into large visible gaps or even blank pages.

Fix per {%page_img} paragraph:
  space_before = 0
  space_after  = 0
  line_spacing = EXACTLY 1pt (image height drives row, not line spacing)
  keep_with_next = False (stop Word from padding pages to avoid breaks)
  keep_together  = False

Separator between datasheets: 2pt instead of a full empty paragraph.

Co-Authored-By: Claude Sonnet 4.6 <noreply@anthropic.com>
</commit_message>
<xml_diff>
--- a/templates/cctv.docx
+++ b/templates/cctv.docx
@@ -2131,7 +2131,10 @@
     </w:p>
     <w:p>
       <w:pPr>
+        <w:keepNext w:val="0"/>
+        <w:keepLines w:val="0"/>
         <w:bidi w:val="1"/>
+        <w:spacing w:before="0" w:after="0" w:lineRule="exact" w:line="20"/>
         <w:jc w:val="center"/>
       </w:pPr>
       <w:r>
@@ -2158,6 +2161,7 @@
     <w:p>
       <w:pPr>
         <w:bidi w:val="1"/>
+        <w:spacing w:before="0" w:after="40"/>
         <w:jc w:val="right"/>
       </w:pPr>
     </w:p>

</xml_diff>

<commit_message>
feat: remove role-label column from cover info table
The 'מגיש/מקבל/בודק/מאשר' column was redundant — the function column
(גורם מבצע / לקוח סופי / ...) already describes the role clearly.

Table is now 3 columns instead of 4:
  col2 (rightmost) = function label  — shaded E8EEF7
  col1             = organisation
  col0 (leftmost)  = person name

Co-Authored-By: Claude Sonnet 4.6 <noreply@anthropic.com>
</commit_message>
<xml_diff>
--- a/templates/cctv.docx
+++ b/templates/cctv.docx
@@ -161,15 +161,14 @@
         <w:tblLook w:firstColumn="1" w:firstRow="1" w:lastColumn="0" w:lastRow="0" w:noHBand="0" w:noVBand="1" w:val="04A0"/>
       </w:tblPr>
       <w:tblGrid>
-        <w:gridCol w:w="2160"/>
-        <w:gridCol w:w="2160"/>
-        <w:gridCol w:w="2160"/>
-        <w:gridCol w:w="2160"/>
+        <w:gridCol w:w="2880"/>
+        <w:gridCol w:w="2880"/>
+        <w:gridCol w:w="2880"/>
       </w:tblGrid>
       <w:tr>
         <w:tc>
           <w:tcPr>
-            <w:tcW w:type="dxa" w:w="2160"/>
+            <w:tcW w:type="dxa" w:w="2880"/>
             <w:vAlign w:val="center"/>
           </w:tcPr>
           <w:p>
@@ -190,7 +189,7 @@
         </w:tc>
         <w:tc>
           <w:tcPr>
-            <w:tcW w:type="dxa" w:w="2160"/>
+            <w:tcW w:type="dxa" w:w="2880"/>
             <w:vAlign w:val="center"/>
           </w:tcPr>
           <w:p>
@@ -211,9 +210,9 @@
         </w:tc>
         <w:tc>
           <w:tcPr>
-            <w:tcW w:type="dxa" w:w="2160"/>
+            <w:tcW w:type="dxa" w:w="2880"/>
             <w:vAlign w:val="center"/>
-            <w:shd w:val="clear" w:color="auto" w:fill="F4F6FA"/>
+            <w:shd w:val="clear" w:color="auto" w:fill="E8EEF7"/>
           </w:tcPr>
           <w:p>
             <w:pPr>
@@ -231,33 +230,11 @@
             </w:r>
           </w:p>
         </w:tc>
-        <w:tc>
-          <w:tcPr>
-            <w:tcW w:type="dxa" w:w="2160"/>
-            <w:vAlign w:val="center"/>
-            <w:shd w:val="clear" w:color="auto" w:fill="E8EEF7"/>
-          </w:tcPr>
-          <w:p>
-            <w:pPr>
-              <w:bidi w:val="1"/>
-              <w:jc w:val="right"/>
-            </w:pPr>
-            <w:r/>
-            <w:r>
-              <w:rPr>
-                <w:rFonts w:ascii="Arial" w:hAnsi="Arial"/>
-                <w:sz w:val="22"/>
-                <w:rtl/>
-              </w:rPr>
-              <w:t>מגיש</w:t>
-            </w:r>
-          </w:p>
-        </w:tc>
       </w:tr>
       <w:tr>
         <w:tc>
           <w:tcPr>
-            <w:tcW w:type="dxa" w:w="2160"/>
+            <w:tcW w:type="dxa" w:w="2880"/>
             <w:vAlign w:val="center"/>
           </w:tcPr>
           <w:p>
@@ -278,7 +255,7 @@
         </w:tc>
         <w:tc>
           <w:tcPr>
-            <w:tcW w:type="dxa" w:w="2160"/>
+            <w:tcW w:type="dxa" w:w="2880"/>
             <w:vAlign w:val="center"/>
           </w:tcPr>
           <w:p>
@@ -299,9 +276,9 @@
         </w:tc>
         <w:tc>
           <w:tcPr>
-            <w:tcW w:type="dxa" w:w="2160"/>
+            <w:tcW w:type="dxa" w:w="2880"/>
             <w:vAlign w:val="center"/>
-            <w:shd w:val="clear" w:color="auto" w:fill="F4F6FA"/>
+            <w:shd w:val="clear" w:color="auto" w:fill="E8EEF7"/>
           </w:tcPr>
           <w:p>
             <w:pPr>
@@ -319,33 +296,11 @@
             </w:r>
           </w:p>
         </w:tc>
-        <w:tc>
-          <w:tcPr>
-            <w:tcW w:type="dxa" w:w="2160"/>
-            <w:vAlign w:val="center"/>
-            <w:shd w:val="clear" w:color="auto" w:fill="E8EEF7"/>
-          </w:tcPr>
-          <w:p>
-            <w:pPr>
-              <w:bidi w:val="1"/>
-              <w:jc w:val="right"/>
-            </w:pPr>
-            <w:r/>
-            <w:r>
-              <w:rPr>
-                <w:rFonts w:ascii="Arial" w:hAnsi="Arial"/>
-                <w:sz w:val="22"/>
-                <w:rtl/>
-              </w:rPr>
-              <w:t>מגיש</w:t>
-            </w:r>
-          </w:p>
-        </w:tc>
       </w:tr>
       <w:tr>
         <w:tc>
           <w:tcPr>
-            <w:tcW w:type="dxa" w:w="2160"/>
+            <w:tcW w:type="dxa" w:w="2880"/>
             <w:vAlign w:val="center"/>
           </w:tcPr>
           <w:p>
@@ -366,7 +321,7 @@
         </w:tc>
         <w:tc>
           <w:tcPr>
-            <w:tcW w:type="dxa" w:w="2160"/>
+            <w:tcW w:type="dxa" w:w="2880"/>
             <w:vAlign w:val="center"/>
           </w:tcPr>
           <w:p>
@@ -387,9 +342,9 @@
         </w:tc>
         <w:tc>
           <w:tcPr>
-            <w:tcW w:type="dxa" w:w="2160"/>
+            <w:tcW w:type="dxa" w:w="2880"/>
             <w:vAlign w:val="center"/>
-            <w:shd w:val="clear" w:color="auto" w:fill="F4F6FA"/>
+            <w:shd w:val="clear" w:color="auto" w:fill="E8EEF7"/>
           </w:tcPr>
           <w:p>
             <w:pPr>
@@ -407,33 +362,11 @@
             </w:r>
           </w:p>
         </w:tc>
-        <w:tc>
-          <w:tcPr>
-            <w:tcW w:type="dxa" w:w="2160"/>
-            <w:vAlign w:val="center"/>
-            <w:shd w:val="clear" w:color="auto" w:fill="E8EEF7"/>
-          </w:tcPr>
-          <w:p>
-            <w:pPr>
-              <w:bidi w:val="1"/>
-              <w:jc w:val="right"/>
-            </w:pPr>
-            <w:r/>
-            <w:r>
-              <w:rPr>
-                <w:rFonts w:ascii="Arial" w:hAnsi="Arial"/>
-                <w:sz w:val="22"/>
-                <w:rtl/>
-              </w:rPr>
-              <w:t>מקבל</w:t>
-            </w:r>
-          </w:p>
-        </w:tc>
       </w:tr>
       <w:tr>
         <w:tc>
           <w:tcPr>
-            <w:tcW w:type="dxa" w:w="2160"/>
+            <w:tcW w:type="dxa" w:w="2880"/>
             <w:vAlign w:val="center"/>
           </w:tcPr>
           <w:p>
@@ -454,7 +387,7 @@
         </w:tc>
         <w:tc>
           <w:tcPr>
-            <w:tcW w:type="dxa" w:w="2160"/>
+            <w:tcW w:type="dxa" w:w="2880"/>
             <w:vAlign w:val="center"/>
           </w:tcPr>
           <w:p>
@@ -475,9 +408,9 @@
         </w:tc>
         <w:tc>
           <w:tcPr>
-            <w:tcW w:type="dxa" w:w="2160"/>
+            <w:tcW w:type="dxa" w:w="2880"/>
             <w:vAlign w:val="center"/>
-            <w:shd w:val="clear" w:color="auto" w:fill="F4F6FA"/>
+            <w:shd w:val="clear" w:color="auto" w:fill="E8EEF7"/>
           </w:tcPr>
           <w:p>
             <w:pPr>
@@ -495,33 +428,11 @@
             </w:r>
           </w:p>
         </w:tc>
-        <w:tc>
-          <w:tcPr>
-            <w:tcW w:type="dxa" w:w="2160"/>
-            <w:vAlign w:val="center"/>
-            <w:shd w:val="clear" w:color="auto" w:fill="E8EEF7"/>
-          </w:tcPr>
-          <w:p>
-            <w:pPr>
-              <w:bidi w:val="1"/>
-              <w:jc w:val="right"/>
-            </w:pPr>
-            <w:r/>
-            <w:r>
-              <w:rPr>
-                <w:rFonts w:ascii="Arial" w:hAnsi="Arial"/>
-                <w:sz w:val="22"/>
-                <w:rtl/>
-              </w:rPr>
-              <w:t>בודק</w:t>
-            </w:r>
-          </w:p>
-        </w:tc>
       </w:tr>
       <w:tr>
         <w:tc>
           <w:tcPr>
-            <w:tcW w:type="dxa" w:w="2160"/>
+            <w:tcW w:type="dxa" w:w="2880"/>
             <w:vAlign w:val="center"/>
           </w:tcPr>
           <w:p>
@@ -542,7 +453,7 @@
         </w:tc>
         <w:tc>
           <w:tcPr>
-            <w:tcW w:type="dxa" w:w="2160"/>
+            <w:tcW w:type="dxa" w:w="2880"/>
             <w:vAlign w:val="center"/>
           </w:tcPr>
           <w:p>
@@ -563,9 +474,9 @@
         </w:tc>
         <w:tc>
           <w:tcPr>
-            <w:tcW w:type="dxa" w:w="2160"/>
+            <w:tcW w:type="dxa" w:w="2880"/>
             <w:vAlign w:val="center"/>
-            <w:shd w:val="clear" w:color="auto" w:fill="F4F6FA"/>
+            <w:shd w:val="clear" w:color="auto" w:fill="E8EEF7"/>
           </w:tcPr>
           <w:p>
             <w:pPr>
@@ -583,33 +494,11 @@
             </w:r>
           </w:p>
         </w:tc>
-        <w:tc>
-          <w:tcPr>
-            <w:tcW w:type="dxa" w:w="2160"/>
-            <w:vAlign w:val="center"/>
-            <w:shd w:val="clear" w:color="auto" w:fill="E8EEF7"/>
-          </w:tcPr>
-          <w:p>
-            <w:pPr>
-              <w:bidi w:val="1"/>
-              <w:jc w:val="right"/>
-            </w:pPr>
-            <w:r/>
-            <w:r>
-              <w:rPr>
-                <w:rFonts w:ascii="Arial" w:hAnsi="Arial"/>
-                <w:sz w:val="22"/>
-                <w:rtl/>
-              </w:rPr>
-              <w:t>מאשר</w:t>
-            </w:r>
-          </w:p>
-        </w:tc>
       </w:tr>
       <w:tr>
         <w:tc>
           <w:tcPr>
-            <w:tcW w:type="dxa" w:w="2160"/>
+            <w:tcW w:type="dxa" w:w="2880"/>
             <w:vAlign w:val="center"/>
           </w:tcPr>
           <w:p>
@@ -629,7 +518,7 @@
         </w:tc>
         <w:tc>
           <w:tcPr>
-            <w:tcW w:type="dxa" w:w="2160"/>
+            <w:tcW w:type="dxa" w:w="2880"/>
             <w:vAlign w:val="center"/>
           </w:tcPr>
           <w:p>
@@ -650,9 +539,9 @@
         </w:tc>
         <w:tc>
           <w:tcPr>
-            <w:tcW w:type="dxa" w:w="2160"/>
+            <w:tcW w:type="dxa" w:w="2880"/>
             <w:vAlign w:val="center"/>
-            <w:shd w:val="clear" w:color="auto" w:fill="F4F6FA"/>
+            <w:shd w:val="clear" w:color="auto" w:fill="E8EEF7"/>
           </w:tcPr>
           <w:p>
             <w:pPr>
@@ -670,33 +559,11 @@
             </w:r>
           </w:p>
         </w:tc>
-        <w:tc>
-          <w:tcPr>
-            <w:tcW w:type="dxa" w:w="2160"/>
-            <w:vAlign w:val="center"/>
-            <w:shd w:val="clear" w:color="auto" w:fill="E8EEF7"/>
-          </w:tcPr>
-          <w:p>
-            <w:pPr>
-              <w:bidi w:val="1"/>
-              <w:jc w:val="right"/>
-            </w:pPr>
-            <w:r/>
-            <w:r>
-              <w:rPr>
-                <w:rFonts w:ascii="Arial" w:hAnsi="Arial"/>
-                <w:sz w:val="22"/>
-                <w:rtl/>
-              </w:rPr>
-              <w:t>תאריך</w:t>
-            </w:r>
-          </w:p>
-        </w:tc>
       </w:tr>
       <w:tr>
         <w:tc>
           <w:tcPr>
-            <w:tcW w:type="dxa" w:w="2160"/>
+            <w:tcW w:type="dxa" w:w="2880"/>
             <w:vAlign w:val="center"/>
           </w:tcPr>
           <w:p>
@@ -716,7 +583,7 @@
         </w:tc>
         <w:tc>
           <w:tcPr>
-            <w:tcW w:type="dxa" w:w="2160"/>
+            <w:tcW w:type="dxa" w:w="2880"/>
             <w:vAlign w:val="center"/>
           </w:tcPr>
           <w:p>
@@ -737,29 +604,7 @@
         </w:tc>
         <w:tc>
           <w:tcPr>
-            <w:tcW w:type="dxa" w:w="2160"/>
-            <w:vAlign w:val="center"/>
-            <w:shd w:val="clear" w:color="auto" w:fill="F4F6FA"/>
-          </w:tcPr>
-          <w:p>
-            <w:pPr>
-              <w:bidi w:val="1"/>
-              <w:jc w:val="right"/>
-            </w:pPr>
-            <w:r/>
-            <w:r>
-              <w:rPr>
-                <w:rFonts w:ascii="Arial" w:hAnsi="Arial"/>
-                <w:sz w:val="22"/>
-                <w:rtl/>
-              </w:rPr>
-              <w:t>תאריך עדכון</w:t>
-            </w:r>
-          </w:p>
-        </w:tc>
-        <w:tc>
-          <w:tcPr>
-            <w:tcW w:type="dxa" w:w="2160"/>
+            <w:tcW w:type="dxa" w:w="2880"/>
             <w:vAlign w:val="center"/>
             <w:shd w:val="clear" w:color="auto" w:fill="E8EEF7"/>
           </w:tcPr>
@@ -775,7 +620,7 @@
                 <w:sz w:val="22"/>
                 <w:rtl/>
               </w:rPr>
-              <w:t>תאריך</w:t>
+              <w:t>תאריך עדכון</w:t>
             </w:r>
           </w:p>
         </w:tc>

</xml_diff>